<commit_message>
Signed readable label for the USC and USD (ncp-03)
draft-usmd-ncp-03 adds a label to Send_usc_properties and
Send_usd_properties: at most 64 bytes of UTF-8 without control
characters, encoded after the identifier and covered by the authority's
signature; it identifies nothing, the USCN and USDN stay ULIDs (error
0x0003 otherwise). draft-usmd-rdsh-architecture-03 9.1 and 9.2 follow.

`config usc` / `config usd` get a label field, and a name left empty is
generated by the authority at commit, then written into the tree. A
non-ULID name is refused with a hint to use the label; a node without the
USC key refuses both. show node and the dashboard print "label (ULID)";
usmd.yaml's readable usd.name and cluster_name become labels. The
acceptance checklist follows ncp-03.

Co-Authored-By: Claude Opus 5.5 <noreply@anthropic.com>
</commit_message>
<xml_diff>
--- a/readme/drafts/draft-usmd-rdsh-architecture-03.docx
+++ b/readme/drafts/draft-usmd-rdsh-architecture-03.docx
@@ -140,7 +140,7 @@
           <w:sz w:val="20"/>
           <w:szCs w:val="20"/>
         </w:rPr>
-        <w:t xml:space="preserve">Cette révision remplace draft-usmd-rdsh-architecture-02 et s'aligne sur draft-usmd-ncp-02, draft-usmd-nndp-01 et draft-usmd-sp-01. Les modifications sont résumées aux annexes D, E et F.</w:t>
+        <w:t xml:space="preserve">Cette révision remplace draft-usmd-rdsh-architecture-02 et s'aligne sur draft-usmd-ncp-03, draft-usmd-nndp-01 et draft-usmd-sp-01. Les modifications sont résumées aux annexes D, E et F.</w:t>
       </w:r>
     </w:p>
     <w:p>
@@ -11480,7 +11480,22 @@
           <w:sz w:val="20"/>
           <w:szCs w:val="20"/>
         </w:rPr>
-        <w:t xml:space="preserve">Les propriétés de l'USC comprennent l'USCN, la version, la clé publique Ed25519 de l'USC et la liste des USD. Leur format est défini par Send_usc_properties [USMD-NCP], section 6.8.</w:t>
+        <w:t xml:space="preserve">Les propriétés de l'USC comprennent l'USCN, un libellé lisible, la version, la clé publique Ed25519 de l'USC et la liste des USD. Leur format est défini par Send_usc_properties [USMD-NCP], section 6.8.</w:t>
+      </w:r>
+    </w:p>
+    <w:p>
+      <w:pPr>
+        <w:spacing w:after="120" w:before="0" w:line="240"/>
+        <w:ind w:left="360"/>
+        <w:jc w:val="left"/>
+      </w:pPr>
+      <w:r>
+        <w:rPr>
+          <w:rFonts w:ascii="Courier New" w:cs="Courier New" w:eastAsia="Courier New" w:hAnsi="Courier New"/>
+          <w:sz w:val="20"/>
+          <w:szCs w:val="20"/>
+        </w:rPr>
+        <w:t xml:space="preserve">L'USCN et l'USDN sont des ULID [ULID] : ils identifient l'USC et l'USD et ne se choisissent pas. Le libellé, choisi par l'autorité, est le nom sous lequel les opérateurs les connaissent (« dho ») ; il est signé et propagé, mais n'identifie rien. Lorsque l'autorité crée un USC ou un USD sans en fournir l'identifiant, elle en génère un.</w:t>
       </w:r>
     </w:p>
     <w:p>
@@ -11512,7 +11527,7 @@
           <w:sz w:val="20"/>
           <w:szCs w:val="20"/>
         </w:rPr>
-        <w:t xml:space="preserve">Les propriétés d'un USD comprennent l'USDN, la version, la clé publique Ed25519 de l'USD, la liste des aires de service, le catalogue des services (section 11) et une liste de paramètres, couples formés d'un code de 16 bits et d'une valeur de 32 bits [USMD-NCP], section 6.9. Les paramètres sont les suivants ; un paramètre absent prend sa valeur par défaut.</w:t>
+        <w:t xml:space="preserve">Les propriétés d'un USD comprennent l'USDN, un libellé lisible, la version, la clé publique Ed25519 de l'USD, la liste des aires de service, le catalogue des services (section 11) et une liste de paramètres, couples formés d'un code de 16 bits et d'une valeur de 32 bits [USMD-NCP], section 6.9. Les paramètres sont les suivants ; un paramètre absent prend sa valeur par défaut.</w:t>
       </w:r>
     </w:p>
     <w:tbl>
@@ -19399,7 +19414,7 @@
                 <w:sz w:val="16"/>
                 <w:szCs w:val="16"/>
               </w:rPr>
-              <w:t xml:space="preserve">« USMD-RDSH : Protocole de cohésion de nœuds (NCP) », draft-usmd-ncp-02</w:t>
+              <w:t xml:space="preserve">« USMD-RDSH : Protocole de cohésion de nœuds (NCP) », draft-usmd-ncp-03</w:t>
             </w:r>
           </w:p>
         </w:tc>
@@ -21787,6 +21802,24 @@
           <w:szCs w:val="20"/>
         </w:rPr>
         <w:t xml:space="preserve">Annexe B : ajout du point « réattribution des identifiants de gestion et identifiants de données ».</w:t>
+      </w:r>
+    </w:p>
+    <w:p>
+      <w:pPr>
+        <w:pStyle w:val="ListParagraph"/>
+        <w:numPr>
+          <w:ilvl w:val="0"/>
+          <w:numId w:val="2"/>
+        </w:numPr>
+        <w:spacing w:after="60" w:line="240"/>
+      </w:pPr>
+      <w:r>
+        <w:rPr>
+          <w:rFonts w:ascii="Courier New" w:cs="Courier New" w:eastAsia="Courier New" w:hAnsi="Courier New"/>
+          <w:sz w:val="20"/>
+          <w:szCs w:val="20"/>
+        </w:rPr>
+        <w:t xml:space="preserve">Section 9 : l'USC et l'USD reçoivent un libellé lisible signé (draft-usmd-ncp-03, sections 6.8 et 6.9) ; l'autorité génère l'USCN ou l'USDN qu'on ne lui fournit pas (décision de l'auteur).</w:t>
       </w:r>
     </w:p>
     <w:p>

</xml_diff>